<commit_message>
WIP: save current local changes
</commit_message>
<xml_diff>
--- a/Gen_AI_ch-1.docx
+++ b/Gen_AI_ch-1.docx
@@ -5334,6 +5334,135 @@
           <w14:ligatures w14:val="none"/>
         </w:rPr>
         <w:t>)</w:t>
+      </w:r>
+    </w:p>
+    <w:p>
+      <w:pPr>
+        <w:rPr>
+          <w:rFonts w:eastAsia="Times New Roman" w:cstheme="minorHAnsi"/>
+          <w:color w:val="000000"/>
+          <w:kern w:val="0"/>
+          <w:lang w:eastAsia="en-GB"/>
+          <w14:ligatures w14:val="none"/>
+        </w:rPr>
+      </w:pPr>
+    </w:p>
+    <w:p>
+      <w:pPr>
+        <w:rPr>
+          <w:rFonts w:eastAsia="Times New Roman" w:cstheme="minorHAnsi"/>
+          <w:color w:val="000000"/>
+          <w:kern w:val="0"/>
+          <w:lang w:eastAsia="en-GB"/>
+          <w14:ligatures w14:val="none"/>
+        </w:rPr>
+      </w:pPr>
+    </w:p>
+    <w:p>
+      <w:pPr>
+        <w:rPr>
+          <w:rFonts w:eastAsia="Times New Roman" w:cstheme="minorHAnsi"/>
+          <w:color w:val="000000"/>
+          <w:kern w:val="0"/>
+          <w:lang w:eastAsia="en-GB"/>
+          <w14:ligatures w14:val="none"/>
+        </w:rPr>
+      </w:pPr>
+    </w:p>
+    <w:p>
+      <w:pPr>
+        <w:rPr>
+          <w:rFonts w:eastAsia="Times New Roman" w:cstheme="minorHAnsi"/>
+          <w:color w:val="000000"/>
+          <w:kern w:val="0"/>
+          <w:lang w:eastAsia="en-GB"/>
+          <w14:ligatures w14:val="none"/>
+        </w:rPr>
+      </w:pPr>
+      <w:r>
+        <w:rPr>
+          <w:rFonts w:eastAsia="Times New Roman" w:cstheme="minorHAnsi"/>
+          <w:color w:val="000000"/>
+          <w:kern w:val="0"/>
+          <w:lang w:eastAsia="en-GB"/>
+          <w14:ligatures w14:val="none"/>
+        </w:rPr>
+        <w:t>RAG- I Indexing your Data:</w:t>
+      </w:r>
+    </w:p>
+    <w:p>
+      <w:pPr>
+        <w:rPr>
+          <w:rFonts w:eastAsia="Times New Roman" w:cstheme="minorHAnsi"/>
+          <w:color w:val="000000"/>
+          <w:kern w:val="0"/>
+          <w:lang w:eastAsia="en-GB"/>
+          <w14:ligatures w14:val="none"/>
+        </w:rPr>
+      </w:pPr>
+      <w:r>
+        <w:rPr>
+          <w:rFonts w:eastAsia="Times New Roman" w:cstheme="minorHAnsi"/>
+          <w:color w:val="000000"/>
+          <w:kern w:val="0"/>
+          <w:lang w:eastAsia="en-GB"/>
+          <w14:ligatures w14:val="none"/>
+        </w:rPr>
+        <w:t xml:space="preserve">Now we know for general chat, we can use: prompt -&gt; model -&gt; generate out. But what if we want to chat based on BYOD i.e. Bring Your Own Data. Every </w:t>
+      </w:r>
+      <w:proofErr w:type="spellStart"/>
+      <w:r>
+        <w:rPr>
+          <w:rFonts w:eastAsia="Times New Roman" w:cstheme="minorHAnsi"/>
+          <w:color w:val="000000"/>
+          <w:kern w:val="0"/>
+          <w:lang w:eastAsia="en-GB"/>
+          <w14:ligatures w14:val="none"/>
+        </w:rPr>
+        <w:t>llm</w:t>
+      </w:r>
+      <w:proofErr w:type="spellEnd"/>
+      <w:r>
+        <w:rPr>
+          <w:rFonts w:eastAsia="Times New Roman" w:cstheme="minorHAnsi"/>
+          <w:color w:val="000000"/>
+          <w:kern w:val="0"/>
+          <w:lang w:eastAsia="en-GB"/>
+          <w14:ligatures w14:val="none"/>
+        </w:rPr>
+        <w:t xml:space="preserve"> has 2 major drawback i.e. 1. Private Data and 2. Current </w:t>
+      </w:r>
+      <w:r>
+        <w:rPr>
+          <w:rFonts w:eastAsia="Times New Roman" w:cstheme="minorHAnsi"/>
+          <w:color w:val="000000"/>
+          <w:kern w:val="0"/>
+          <w:lang w:eastAsia="en-GB"/>
+          <w14:ligatures w14:val="none"/>
+        </w:rPr>
+        <w:lastRenderedPageBreak/>
+        <w:t>Events. Both the case will lead to model hallucinate – finding misleading or false information and respond with inaccurate information. Adapting prompt won’t resolve the issue because it relies on model’s current knowledge.</w:t>
+      </w:r>
+    </w:p>
+    <w:p>
+      <w:pPr>
+        <w:rPr>
+          <w:rFonts w:eastAsia="Times New Roman" w:cstheme="minorHAnsi"/>
+          <w:color w:val="000000"/>
+          <w:kern w:val="0"/>
+          <w:lang w:eastAsia="en-GB"/>
+          <w14:ligatures w14:val="none"/>
+        </w:rPr>
+      </w:pPr>
+      <w:r>
+        <w:rPr>
+          <w:rFonts w:eastAsia="Times New Roman" w:cstheme="minorHAnsi"/>
+          <w:color w:val="000000"/>
+          <w:kern w:val="0"/>
+          <w:lang w:eastAsia="en-GB"/>
+          <w14:ligatures w14:val="none"/>
+        </w:rPr>
+        <w:t xml:space="preserve">Goal – 1: Picking Relevant Context for LLMs: </w:t>
       </w:r>
     </w:p>
     <w:sectPr>

</xml_diff>